<commit_message>
Favoritenfunktion bei der Datenauswahl
</commit_message>
<xml_diff>
--- a/TlogP_Sounding_Viewer_Dokumentation.docx
+++ b/TlogP_Sounding_Viewer_Dokumentation.docx
@@ -2038,7 +2038,7 @@
         <w:pStyle w:val="ListBullet"/>
       </w:pPr>
       <w:r>
-        <w:t xml:space="preserve">Modelllevel / Druckflächen – Ort per Karte oder Koordinaten, Live-Abruf von Open-Meteo; ein Alias wird per Reverse-Geocoding vorgeschlagen</w:t>
+        <w:t xml:space="preserve">Modelllevel / Druckflächen – Ort per Karte, Koordinaten oder Ortssuche, Live-Abruf von Open-Meteo; ein Alias wird per Reverse-Geocoding vorgeschlagen</w:t>
       </w:r>
     </w:p>
     <w:p>
@@ -2061,6 +2061,44 @@
       <w:pPr/>
       <w:r>
         <w:t xml:space="preserve">Die erste geladene Kurve wird zur Hauptkurve; weitere Kurven werden als Vergleich dazugeladen, sofern die Checkbox „Bestand ersetzen“ nicht gesetzt ist. Die Daten sind nach Ort → Serie → Kurve gegliedert (Serie = Quelle + Modell/Lauf + Ort, Kurve = Zeitpunkt). Im Datenpanel wählt ein Radio-Button die Hauptkurve, auf die sich Zeitleiste, Indizes und Hodograph beziehen.</w:t>
+      </w:r>
+    </w:p>
+    <w:p>
+      <w:pPr/>
+      <w:r>
+        <w:t xml:space="preserve">Ortssuche, Historie und Favoriten: Über der Karte (Reiter Modelllevel, Druckflächen und Messung) steht ein Suchfeld nach dem Vorbild von Dronecast und Trajektorientool:</w:t>
+      </w:r>
+    </w:p>
+    <w:p>
+      <w:pPr>
+        <w:pStyle w:val="ListBullet"/>
+      </w:pPr>
+      <w:r>
+        <w:t xml:space="preserve">Klick in das leere Feld zeigt die zuletzt geladenen Orte (bis zu 8) mit Alias, Ortsname und Koordinate. Auswahl setzt Marker, Koordinaten und den gespeicherten Alias.</w:t>
+      </w:r>
+    </w:p>
+    <w:p>
+      <w:pPr>
+        <w:pStyle w:val="ListBullet"/>
+      </w:pPr>
+      <w:r>
+        <w:t xml:space="preserve">☆/★ markiert einen Ort als Favorit; Favoriten zählen nicht zu den 8 und werden nie aus der Liste verdrängt.</w:t>
+      </w:r>
+    </w:p>
+    <w:p>
+      <w:pPr>
+        <w:pStyle w:val="ListBullet"/>
+      </w:pPr>
+      <w:r>
+        <w:t xml:space="preserve">Tippen sucht einen Ortsnamen (Photon); Dezimalkoordinaten wie „47.98, 11.23“ oder „47.98N 11.23E“ werden direkt erkannt und mit Enter übernommen. Pfeiltasten wählen, Esc schließt die Liste.</w:t>
+      </w:r>
+    </w:p>
+    <w:p>
+      <w:pPr>
+        <w:pStyle w:val="ListBullet"/>
+      </w:pPr>
+      <w:r>
+        <w:t xml:space="preserve">In die Historie kommt ein Ort erst nach einem erfolgreichen Modelllevel- oder Druckflächen-Abruf; erneutes Laden desselben Orts schiebt den Eintrag nach oben, der Favoritenstatus bleibt. Gespeichert wird im Browser (localStorage), also pro Browser und Gerät.</w:t>
       </w:r>
     </w:p>
     <w:p>

</xml_diff>

<commit_message>
Favoriten/Historie merken zuletzt verwendetes Modell und Vorhersagestunden
Co-Authored-By: Claude Opus 5.5 <noreply@anthropic.com>
</commit_message>
<xml_diff>
--- a/TlogP_Sounding_Viewer_Dokumentation.docx
+++ b/TlogP_Sounding_Viewer_Dokumentation.docx
@@ -2074,7 +2074,7 @@
         <w:pStyle w:val="ListBullet"/>
       </w:pPr>
       <w:r>
-        <w:t xml:space="preserve">Klick in das leere Feld zeigt die zuletzt geladenen Orte (bis zu 8) mit Alias, Ortsname und Koordinate. Auswahl setzt Marker, Koordinaten und den gespeicherten Alias.</w:t>
+        <w:t xml:space="preserve">Klick in das leere Feld zeigt die zuletzt geladenen Orte (bis zu 8) mit Alias, Ortsname, Koordinate sowie zuletzt verwendetem Modell und Vorhersagestunden (z. B. „ICON-D2 (ML) 0:48:1“). Auswahl setzt Marker, Koordinaten und den gespeicherten Alias.</w:t>
       </w:r>
     </w:p>
     <w:p>
@@ -2099,6 +2099,14 @@
       </w:pPr>
       <w:r>
         <w:t xml:space="preserve">In die Historie kommt ein Ort erst nach einem erfolgreichen Modelllevel- oder Druckflächen-Abruf; erneutes Laden desselben Orts schiebt den Eintrag nach oben, der Favoritenstatus bleibt. Gespeichert wird im Browser (localStorage), also pro Browser und Gerät.</w:t>
+      </w:r>
+    </w:p>
+    <w:p>
+      <w:pPr>
+        <w:pStyle w:val="ListBullet"/>
+      </w:pPr>
+      <w:r>
+        <w:t xml:space="preserve">Zu jedem Ort werden auch das zuletzt benutzte Modell und die Vorhersagestunden (Laufzeit und Zeitinkrement, z. B. „0:48:1“) gespeichert. Bei der Auswahl im Reiter Modelllevel oder Druckflächen werden beide wieder eingesetzt; gehört das Modell zum anderen Reiter, wechselt der Dialog dorthin. Lauf-Datum und -Stunde der Druckflächen werden bewusst nicht gespeichert, dort bleibt der jüngste Lauf voreingestellt. Im Reiter Messung wird nur der Ort übernommen.</w:t>
       </w:r>
     </w:p>
     <w:p>

</xml_diff>

<commit_message>
Vereisungsdiagnose (ADWICE nach Tafferner 2003) und −8D-Kurve im Viewer
Neues Panel „Vereisung (ADWICE/−8D)“ für die Hauptkurve: Szenarien
(gefrierender Regen, labil, warmer Stratus, allgemein) nach dem
NCAR/RAP-Algorithmus in der ADWICE-Fassung von Tafferner et al. (2003),
Intensität aus dem adiabatischen LWC ab der Wolkenbasis mit Lewis-Klassen,
in Schichtwolken ab 500 m über der Basis konstant (Korolev et al. 2007),
unter −15 °C höchstens mäßig, Eisart nach Krutina. Modell-Wolkenwasser/-eis
nur als Zusatzspalte. Im Diagramm Szenario-Balken, Intensitätsbänder und
die −8D-Kurve, getrennt schaltbar. Handbuch: Kapitel 8 neu, Quellen ergänzt.

Co-Authored-By: Claude Opus 5.5 <noreply@anthropic.com>
</commit_message>
<xml_diff>
--- a/TlogP_Sounding_Viewer_Dokumentation.docx
+++ b/TlogP_Sounding_Viewer_Dokumentation.docx
@@ -1267,7 +1267,587 @@
         <w:jc w:val="left"/>
       </w:pPr>
       <w:r>
-        <w:t>8  Schichtwolkenerkennung</w:t>
+        <w:t xml:space="preserve">8  Vereisung</w:t>
+      </w:r>
+    </w:p>
+    <w:p>
+      <w:pPr/>
+      <w:r>
+        <w:t xml:space="preserve">Die Vereisungsdiagnose folgt dem Verfahren von ADWICE (Advanced Diagnosis and Warning System for Aircraft Icing Environments, DWD/DLR) in der dokumentierten Fassung von Tafferner et al. (2003). Ergänzt wird es um Regeln aus Krutina (2006) und um die klassische −8D-Kurve. Ausgewertet wird nur die Hauptkurve, nicht die Vergleichskurven. Der Schalter sitzt in der Seitenleiste unter „Vereisung (ADWICE/−8D)“. Zwei Unterschalter blenden die −8D-Kurve und die ADWICE-Schichten im Diagramm getrennt ein und aus; die Tabelle wird immer berechnet.</w:t>
+      </w:r>
+    </w:p>
+    <w:p>
+      <w:pPr>
+        <w:pStyle w:val="Heading2"/>
+        <w:jc w:val="left"/>
+      </w:pPr>
+      <w:r>
+        <w:t xml:space="preserve">8.1  Szenarien</w:t>
+      </w:r>
+    </w:p>
+    <w:p>
+      <w:pPr/>
+      <w:r>
+        <w:t xml:space="preserve">Jedes Niveau wird anhand von Temperatur und relativer Feuchte über Wasser (RH) einem von vier Szenarien zugeordnet (NCAR/RAP-Algorithmus, Tafferner et al. 2003, Fig. 2). Die RH-Schwelle x(T) steigt linear von 63 % bei −20 °C auf 82 % bei 0 °C; sie geht auf Radiosondenaufstiege in der Nähe von Vereisungsmeldungen zurück (Forbes et al. 1993: mittlere RH 82 %, Standardabweichung 19 %).</w:t>
+      </w:r>
+    </w:p>
+    <w:tbl>
+      <w:tblPr>
+        <w:tblStyle w:val="TableGrid"/>
+        <w:tblW w:type="auto" w:w="0"/>
+        <w:tblLook w:firstColumn="1" w:firstRow="1" w:lastColumn="0" w:lastRow="0" w:noHBand="0" w:noVBand="1" w:val="04A0"/>
+      </w:tblPr>
+      <w:tblGrid>
+        <w:gridCol w:w="2000"/>
+        <w:gridCol w:w="5300"/>
+        <w:gridCol w:w="1822"/>
+      </w:tblGrid>
+      <w:tr>
+        <w:tc>
+          <w:tcPr>
+            <w:tcW w:type="dxa" w:w="2000"/>
+          </w:tcPr>
+          <w:p>
+            <w:r>
+              <w:rPr>
+                <w:b/>
+              </w:rPr>
+              <w:t xml:space="preserve">Szenario</w:t>
+            </w:r>
+          </w:p>
+        </w:tc>
+        <w:tc>
+          <w:tcPr>
+            <w:tcW w:type="dxa" w:w="5300"/>
+          </w:tcPr>
+          <w:p>
+            <w:r>
+              <w:rPr>
+                <w:b/>
+              </w:rPr>
+              <w:t xml:space="preserve">Bedingung</w:t>
+            </w:r>
+          </w:p>
+        </w:tc>
+        <w:tc>
+          <w:tcPr>
+            <w:tcW w:type="dxa" w:w="1822"/>
+          </w:tcPr>
+          <w:p>
+            <w:r>
+              <w:rPr>
+                <w:b/>
+              </w:rPr>
+              <w:t xml:space="preserve">Rangfolge</w:t>
+            </w:r>
+          </w:p>
+        </w:tc>
+      </w:tr>
+      <w:tr>
+        <w:tc>
+          <w:tcPr>
+            <w:tcW w:type="dxa" w:w="2000"/>
+          </w:tcPr>
+          <w:p>
+            <w:r>
+              <w:t xml:space="preserve">Gefrierender Regen</w:t>
+            </w:r>
+          </w:p>
+        </w:tc>
+        <w:tc>
+          <w:tcPr>
+            <w:tcW w:type="dxa" w:w="5300"/>
+          </w:tcPr>
+          <w:p>
+            <w:r>
+              <w:t xml:space="preserve">Bodennahe Kaltluft (T ≤ 0 °C) unter einer warmen Nase (T &gt; 0 °C); über der warmen Nase eine Schicht mit RH ≥ 80 %; zugeordnet werden die Niveaus der Kaltluft mit RH ≥ 80 %</w:t>
+            </w:r>
+          </w:p>
+        </w:tc>
+        <w:tc>
+          <w:tcPr>
+            <w:tcW w:type="dxa" w:w="1822"/>
+          </w:tcPr>
+          <w:p>
+            <w:r>
+              <w:t xml:space="preserve">höchste</w:t>
+            </w:r>
+          </w:p>
+        </w:tc>
+      </w:tr>
+      <w:tr>
+        <w:tc>
+          <w:tcPr>
+            <w:tcW w:type="dxa" w:w="2000"/>
+          </w:tcPr>
+          <w:p>
+            <w:r>
+              <w:t xml:space="preserve">Labil</w:t>
+            </w:r>
+          </w:p>
+        </w:tc>
+        <w:tc>
+          <w:tcPr>
+            <w:tcW w:type="dxa" w:w="5300"/>
+          </w:tcPr>
+          <w:p>
+            <w:r>
+              <w:t xml:space="preserve">−20 bis 0 °C und RH ≥ 63 %; direkt darunter eine Schicht, die steiler als feuchtadiabatisch abkühlt, mit maximaler RH ≥ x(T)</w:t>
+            </w:r>
+          </w:p>
+        </w:tc>
+        <w:tc>
+          <w:tcPr>
+            <w:tcW w:type="dxa" w:w="1822"/>
+          </w:tcPr>
+          <w:p>
+            <w:r>
+              <w:t xml:space="preserve">überschreibt Warmer Stratus und Allgemein</w:t>
+            </w:r>
+          </w:p>
+        </w:tc>
+      </w:tr>
+      <w:tr>
+        <w:tc>
+          <w:tcPr>
+            <w:tcW w:type="dxa" w:w="2000"/>
+          </w:tcPr>
+          <w:p>
+            <w:r>
+              <w:t xml:space="preserve">Warmer Stratus</w:t>
+            </w:r>
+          </w:p>
+        </w:tc>
+        <w:tc>
+          <w:tcPr>
+            <w:tcW w:type="dxa" w:w="5300"/>
+          </w:tcPr>
+          <w:p>
+            <w:r>
+              <w:t xml:space="preserve">−12 bis 0 °C und RH ≥ 85 %; darüber keine Schicht zwischen −12 und −50 °C mit RH ≥ 85 % (keine Niederschlagswolke, Cirren kälter als −50 °C stören nicht)</w:t>
+            </w:r>
+          </w:p>
+        </w:tc>
+        <w:tc>
+          <w:tcPr>
+            <w:tcW w:type="dxa" w:w="1822"/>
+          </w:tcPr>
+          <w:p>
+            <w:r>
+              <w:t xml:space="preserve">überschreibt Allgemein</w:t>
+            </w:r>
+          </w:p>
+        </w:tc>
+      </w:tr>
+      <w:tr>
+        <w:tc>
+          <w:tcPr>
+            <w:tcW w:type="dxa" w:w="2000"/>
+          </w:tcPr>
+          <w:p>
+            <w:r>
+              <w:t xml:space="preserve">Allgemein</w:t>
+            </w:r>
+          </w:p>
+        </w:tc>
+        <w:tc>
+          <w:tcPr>
+            <w:tcW w:type="dxa" w:w="5300"/>
+          </w:tcPr>
+          <w:p>
+            <w:r>
+              <w:t xml:space="preserve">−16 bis 0 °C und RH ≥ x(T)</w:t>
+            </w:r>
+          </w:p>
+        </w:tc>
+        <w:tc>
+          <w:tcPr>
+            <w:tcW w:type="dxa" w:w="1822"/>
+          </w:tcPr>
+          <w:p>
+            <w:r>
+              <w:t xml:space="preserve">niedrigste</w:t>
+            </w:r>
+          </w:p>
+        </w:tc>
+      </w:tr>
+    </w:tbl>
+    <w:p/>
+    <w:p>
+      <w:pPr/>
+      <w:r>
+        <w:t xml:space="preserve">Die Ausnahme für Cirren beschreibt Tafferner et al. (2003) nur knapp. Die Grenze von −50 °C ist unsere Lesart dieser Stelle. In der späteren ADWICE-Fassung (Kalinka et al. 2017) weichen die Schwellen ab: „Allgemein“ reicht dort bis −20 °C, „Stratiform“ verlangt RH ≥ 80 % mit einem RH-Abfall von mindestens 2,5 % pro 100 m an der Obergrenze, und „Konvektiv“ wird aus dem Konvektionsschema des Modells bestimmt. Diese Fassung ist nur teilweise veröffentlicht und wurde deshalb nicht übernommen.</w:t>
+      </w:r>
+    </w:p>
+    <w:p>
+      <w:pPr>
+        <w:pStyle w:val="Heading2"/>
+        <w:jc w:val="left"/>
+      </w:pPr>
+      <w:r>
+        <w:t xml:space="preserve">8.2  Flüssigwassergehalt</w:t>
+      </w:r>
+    </w:p>
+    <w:p>
+      <w:pPr/>
+      <w:r>
+        <w:t xml:space="preserve">Die Intensität hängt vom Gehalt an unterkühltem Flüssigwasser ab (LWC). Er wird adiabatisch abgeschätzt: Luft, die von der Wolkenbasis aufsteigt, kondensiert die Differenz der Sättigungsmischungsverhältnisse aus (Tafferner et al. 2003, Gl. 1; Krutina 2006, Form. 1):</w:t>
+      </w:r>
+    </w:p>
+    <w:p>
+      <w:pPr/>
+      <w:r>
+        <w:t xml:space="preserve">LWC(h) = (r_s,Basis − r_s(h)) · p_h / (R · T_h)    [g/m³, r in g/kg, p in Pa, R = 287 J/(kg·K)]</w:t>
+      </w:r>
+    </w:p>
+    <w:p>
+      <w:pPr>
+        <w:pStyle w:val="ListBullet"/>
+      </w:pPr>
+      <w:r>
+        <w:t xml:space="preserve">Der LWC wächst mit dem Abstand zur Wolkenbasis, also mit der Wolkendicke. Ausgewertet wird der Wert ab der Wolkenbasis, nicht der Zuwachs pro Modellschicht. Tafferner et al. (2003, Tab. 3) zeigen, dass der Zuwachs pro Schicht die Intensität gegenüber Pilotenmeldungen systematisch unterschätzt.</w:t>
+      </w:r>
+    </w:p>
+    <w:p>
+      <w:pPr>
+        <w:pStyle w:val="ListBullet"/>
+      </w:pPr>
+      <w:r>
+        <w:t xml:space="preserve">Wolkenbasis: unterstes Niveau des zusammenhängend gesättigten Bereichs (RH ≥ 98 %) unter einer Vereisungszone, auch wenn es wärmer als 0 °C ist (Krutina 2006, 5.1a: eine warme Wolkenbasis bedeutet viel Flüssigwasser). Ist die Unterkante der Zone nicht gesättigt, gilt wie bei Tafferner et al. (2003) die Unterkante der Vereisungszone als Basis.</w:t>
+      </w:r>
+    </w:p>
+    <w:p>
+      <w:pPr>
+        <w:pStyle w:val="ListBullet"/>
+      </w:pPr>
+      <w:r>
+        <w:t xml:space="preserve">Abweichend von Tafferner und Krutina wird im Niveau h das Sättigungsmischungsverhältnis r_s(h) statt des tatsächlichen Mischungsverhältnisses verwendet. Sonst ergäbe trockenere Luft mehr Flüssigwasser, und der Wert könnte über der adiabatischen Obergrenze liegen. In gesättigter Luft sind beide Varianten gleich.</w:t>
+      </w:r>
+    </w:p>
+    <w:p>
+      <w:pPr>
+        <w:pStyle w:val="ListBullet"/>
+      </w:pPr>
+      <w:r>
+        <w:t xml:space="preserve">Gerechnet wird mit dem Temperaturprofil selbst, nicht mit einem feuchtadiabatisch gehobenen Paket. In isothermen Schichten und Inversionen wächst der LWC deshalb nicht weiter.</w:t>
+      </w:r>
+    </w:p>
+    <w:p>
+      <w:pPr/>
+      <w:r>
+        <w:t xml:space="preserve">Die adiabatische Formel kennt weder die Einmischung trockener Umgebungsluft noch das Ausfallen von Niederschlag, die Vereisung der Wolke (Bergeron-Findeisen) oder gleitende Hebung an Fronten. In tiefen, durchgehend gesättigten Schichten wächst der Wert deshalb unrealistisch weit. Zwei Anpassungen begrenzen das:</w:t>
+      </w:r>
+    </w:p>
+    <w:p>
+      <w:pPr>
+        <w:pStyle w:val="ListBullet"/>
+      </w:pPr>
+      <w:r>
+        <w:t xml:space="preserve">Schichtwolken (Szenarien „Allgemein“ und „Warmer Stratus“): Korolev et al. (2007) haben 584 LWC-Profile in unterkühlten Frontwolken gemessen. Der LWC wächst nur in den untersten rund 500 m über der Wolkenbasis annähernd adiabatisch und bleibt darüber etwa konstant (im Mittel 0,14 g/m³); nahe der Obergrenze von Wolken über 2 km Dicke ist er 5- bis 10-mal kleiner als adiabatisch. Der Viewer hält den LWC deshalb ab 500 m über der Basis auf dem dort erreichten Wert. Die Höhe über der Basis wird hypsometrisch aus Druck und Temperatur berechnet.</w:t>
+      </w:r>
+    </w:p>
+    <w:p>
+      <w:pPr>
+        <w:pStyle w:val="ListBullet"/>
+      </w:pPr>
+      <w:r>
+        <w:t xml:space="preserve">Labile Schichtung (Szenario „Labil“): Hier startet das aufsteigende Paket an der Unterkante der labilen Schicht, aus der Tafferner et al. (2003) das Szenario ableiten, sofern diese über der Wolkenbasis liegt. Einen Deckel gibt es nicht, weil in Quellwolken deutlich höhere LWC-Werte vorkommen (Krutina 2006, Tab. 10: häufig bis 5 g/m³). Diese Wahl der Basis ist eine eigene Festlegung.</w:t>
+      </w:r>
+    </w:p>
+    <w:p>
+      <w:pPr>
+        <w:pStyle w:val="Heading2"/>
+        <w:jc w:val="left"/>
+      </w:pPr>
+      <w:r>
+        <w:t xml:space="preserve">8.3  Intensität</w:t>
+      </w:r>
+    </w:p>
+    <w:p>
+      <w:pPr/>
+      <w:r>
+        <w:t xml:space="preserve">Die Klassen stammen aus Lewis (1947), zitiert nach Tafferner et al. (2003, Tab. 2). Für die Szenarien „Allgemein“ und „Warmer Stratus“ gilt die Spalte Schichtwolken, für „Labil“ die Spalte Quellwolken. Gefrierender Regen ist immer „stark“, weil dort große unterkühlte Tropfen fast sicher sind.</w:t>
+      </w:r>
+    </w:p>
+    <w:tbl>
+      <w:tblPr>
+        <w:tblStyle w:val="TableGrid"/>
+        <w:tblW w:type="auto" w:w="0"/>
+        <w:tblLook w:firstColumn="1" w:firstRow="1" w:lastColumn="0" w:lastRow="0" w:noHBand="0" w:noVBand="1" w:val="04A0"/>
+      </w:tblPr>
+      <w:tblGrid>
+        <w:gridCol w:w="3040"/>
+        <w:gridCol w:w="3041"/>
+        <w:gridCol w:w="3041"/>
+      </w:tblGrid>
+      <w:tr>
+        <w:tc>
+          <w:tcPr>
+            <w:tcW w:type="dxa" w:w="3040"/>
+          </w:tcPr>
+          <w:p>
+            <w:r>
+              <w:rPr>
+                <w:b/>
+              </w:rPr>
+              <w:t xml:space="preserve">Intensität</w:t>
+            </w:r>
+          </w:p>
+        </w:tc>
+        <w:tc>
+          <w:tcPr>
+            <w:tcW w:type="dxa" w:w="3041"/>
+          </w:tcPr>
+          <w:p>
+            <w:r>
+              <w:rPr>
+                <w:b/>
+              </w:rPr>
+              <w:t xml:space="preserve">Schichtwolken LWC [g/m³]</w:t>
+            </w:r>
+          </w:p>
+        </w:tc>
+        <w:tc>
+          <w:tcPr>
+            <w:tcW w:type="dxa" w:w="3041"/>
+          </w:tcPr>
+          <w:p>
+            <w:r>
+              <w:rPr>
+                <w:b/>
+              </w:rPr>
+              <w:t xml:space="preserve">Quellwolken LWC [g/m³]</w:t>
+            </w:r>
+          </w:p>
+        </w:tc>
+      </w:tr>
+      <w:tr>
+        <w:tc>
+          <w:tcPr>
+            <w:tcW w:type="dxa" w:w="3040"/>
+          </w:tcPr>
+          <w:p>
+            <w:r>
+              <w:t xml:space="preserve">Spuren</w:t>
+            </w:r>
+          </w:p>
+        </w:tc>
+        <w:tc>
+          <w:tcPr>
+            <w:tcW w:type="dxa" w:w="3041"/>
+          </w:tcPr>
+          <w:p>
+            <w:r>
+              <w:t xml:space="preserve">&lt; 0,11</w:t>
+            </w:r>
+          </w:p>
+        </w:tc>
+        <w:tc>
+          <w:tcPr>
+            <w:tcW w:type="dxa" w:w="3041"/>
+          </w:tcPr>
+          <w:p>
+            <w:r>
+              <w:t xml:space="preserve">&lt; 0,07</w:t>
+            </w:r>
+          </w:p>
+        </w:tc>
+      </w:tr>
+      <w:tr>
+        <w:tc>
+          <w:tcPr>
+            <w:tcW w:type="dxa" w:w="3040"/>
+          </w:tcPr>
+          <w:p>
+            <w:r>
+              <w:t xml:space="preserve">Leicht</w:t>
+            </w:r>
+          </w:p>
+        </w:tc>
+        <w:tc>
+          <w:tcPr>
+            <w:tcW w:type="dxa" w:w="3041"/>
+          </w:tcPr>
+          <w:p>
+            <w:r>
+              <w:t xml:space="preserve">0,11–0,69</w:t>
+            </w:r>
+          </w:p>
+        </w:tc>
+        <w:tc>
+          <w:tcPr>
+            <w:tcW w:type="dxa" w:w="3041"/>
+          </w:tcPr>
+          <w:p>
+            <w:r>
+              <w:t xml:space="preserve">0,07–0,50</w:t>
+            </w:r>
+          </w:p>
+        </w:tc>
+      </w:tr>
+      <w:tr>
+        <w:tc>
+          <w:tcPr>
+            <w:tcW w:type="dxa" w:w="3040"/>
+          </w:tcPr>
+          <w:p>
+            <w:r>
+              <w:t xml:space="preserve">Mäßig</w:t>
+            </w:r>
+          </w:p>
+        </w:tc>
+        <w:tc>
+          <w:tcPr>
+            <w:tcW w:type="dxa" w:w="3041"/>
+          </w:tcPr>
+          <w:p>
+            <w:r>
+              <w:t xml:space="preserve">0,69–1,33</w:t>
+            </w:r>
+          </w:p>
+        </w:tc>
+        <w:tc>
+          <w:tcPr>
+            <w:tcW w:type="dxa" w:w="3041"/>
+          </w:tcPr>
+          <w:p>
+            <w:r>
+              <w:t xml:space="preserve">0,50–1,0</w:t>
+            </w:r>
+          </w:p>
+        </w:tc>
+      </w:tr>
+      <w:tr>
+        <w:tc>
+          <w:tcPr>
+            <w:tcW w:type="dxa" w:w="3040"/>
+          </w:tcPr>
+          <w:p>
+            <w:r>
+              <w:t xml:space="preserve">Stark</w:t>
+            </w:r>
+          </w:p>
+        </w:tc>
+        <w:tc>
+          <w:tcPr>
+            <w:tcW w:type="dxa" w:w="3041"/>
+          </w:tcPr>
+          <w:p>
+            <w:r>
+              <w:t xml:space="preserve">&gt; 1,33</w:t>
+            </w:r>
+          </w:p>
+        </w:tc>
+        <w:tc>
+          <w:tcPr>
+            <w:tcW w:type="dxa" w:w="3041"/>
+          </w:tcPr>
+          <w:p>
+            <w:r>
+              <w:t xml:space="preserve">&gt; 1,0</w:t>
+            </w:r>
+          </w:p>
+        </w:tc>
+      </w:tr>
+    </w:tbl>
+    <w:p/>
+    <w:p>
+      <w:pPr/>
+      <w:r>
+        <w:t xml:space="preserve">Eigene Ergänzung: Unter −15 °C wird höchstens „mäßig“ ausgegeben, außer bei gefrierendem Regen. Grundlage ist Krutina (2006, 6.1a): Starke Vereisung ist unter −15 °C ungewöhnlich, und die Vereisung der Wolke, die der adiabatische LWC nicht kennt, setzt ab etwa −10 °C ein.</w:t>
+      </w:r>
+    </w:p>
+    <w:p>
+      <w:pPr/>
+      <w:r>
+        <w:t xml:space="preserve">Mit dem Deckel nach Korolev erreichen Schichtwolken die Schwelle für „mäßig“ (0,69 g/m³) nur selten; das deckt sich mit den Messungen (Korolev et al. 2007: höchster Wert pro Schicht im Mittel 0,32 g/m³, Maximum 1,0 g/m³) und mit Krutina (2006, Tab. 10: Schichtwolken im Mittel 0,1–0,4 g/m³). Pilotenmeldungen nennen in tiefen Schichtwolken aber durchaus „mäßig“ und „stark“ (Tafferner et al. 2003, Tab. 3). Die tatsächliche Vereisung hängt auch von der Tropfengröße (große unterkühlte Tropfen), dem Flugzeugtyp und der Flugdauer in der Wolke ab, die der LWC nicht abbildet. Die Intensitäten sind deshalb als Orientierung zu verstehen; Abweichungen von der Realität sollen gesammelt und die Schwellen dann angepasst werden.</w:t>
+      </w:r>
+    </w:p>
+    <w:p>
+      <w:pPr>
+        <w:pStyle w:val="Heading2"/>
+        <w:jc w:val="left"/>
+      </w:pPr>
+      <w:r>
+        <w:t xml:space="preserve">8.4  Art des Eisansatzes</w:t>
+      </w:r>
+    </w:p>
+    <w:p>
+      <w:pPr/>
+      <w:r>
+        <w:t xml:space="preserve">Die Eisart wird nach Krutina (2006, Tab. 23) aus Szenario und Temperatur abgeleitet: Klareis bei gefrierendem Regen und in labiler Schichtung bis −8 °C, Mischeis in labiler Schichtung von −9 bis −15 °C, Raueis in labiler Schichtung unter −15 °C sowie bei „Warmer Stratus“ und „Allgemein“.</w:t>
+      </w:r>
+    </w:p>
+    <w:p>
+      <w:pPr>
+        <w:pStyle w:val="Heading2"/>
+        <w:jc w:val="left"/>
+      </w:pPr>
+      <w:r>
+        <w:t xml:space="preserve">8.5  Modell-Wolkenwasser</w:t>
+      </w:r>
+    </w:p>
+    <w:p>
+      <w:pPr/>
+      <w:r>
+        <w:t xml:space="preserve">Liefert die Datenquelle Wolkenwasser und -eis (ICON-Modellflächen), zeigt die Spalte „Modell“, was das Modell in der Schicht meldet: „Wasser“, wenn ein Niveau Flüssigwasser enthält, „Eis“ bei reinem Wolkeneis, „–“ ohne Kondensat. Diese Angabe ist nur eine Zusatzinformation und fließt nicht in die Intensität ein. Tafferner et al. (2003) fanden, dass das Modell-Wolkenwasser in Vereisungszonen fast überall nahe null lag und als Maß der Intensität versagte. Die spätere ADWICE-Fassung (Kalinka et al. 2017) nutzt es nur noch als Hinweis, ob überhaupt Flüssigwasser vorhanden ist.</w:t>
+      </w:r>
+    </w:p>
+    <w:p>
+      <w:pPr>
+        <w:pStyle w:val="Heading2"/>
+        <w:jc w:val="left"/>
+      </w:pPr>
+      <w:r>
+        <w:t xml:space="preserve">8.6  Darstellung</w:t>
+      </w:r>
+    </w:p>
+    <w:p>
+      <w:pPr>
+        <w:pStyle w:val="ListBullet"/>
+      </w:pPr>
+      <w:r>
+        <w:t xml:space="preserve">Seitenleiste: eine Zeile je Schicht mit gleichem Szenario, gleicher Intensität und Eisart, als FL-Bereich (Flugfläche aus dem Druck nach ICAO-Standardatmosphäre). Das farbige Kästchen vor der Schicht zeigt das Szenario. Hält man die Maus kurz auf einer Zeile, zeigt ein Tooltip Szenario und maximalen LWC (nicht auf Touch-Geräten).</w:t>
+      </w:r>
+    </w:p>
+    <w:p>
+      <w:pPr>
+        <w:pStyle w:val="ListBullet"/>
+      </w:pPr>
+      <w:r>
+        <w:t xml:space="preserve">Diagramm: ein schmaler Balken am rechten Rand zeigt das Szenario in den ADWICE-Farben (blau allgemein, gelb warmer Stratus, grün labil, rot gefrierender Regen). Ab „leicht“ wird die Schicht zusätzlich über die volle Breite eingefärbt (hellblau leicht, gelb mäßig, rot stark).</w:t>
+      </w:r>
+    </w:p>
+    <w:p>
+      <w:pPr>
+        <w:pStyle w:val="ListBullet"/>
+      </w:pPr>
+      <w:r>
+        <w:t xml:space="preserve">−8D-Kurve (Godske, Krutina 2006, 6.2.1.1): gestrichelt bei 0 bis −40 °C, berechnet als −8·(T − Td). Liegt die Temperaturkurve links davon, ist Vereisung wahrscheinlich; im Bereich 0 bis −20 °C wird die Fläche zwischen T und −8D eingefärbt, schwächer dort, wo das Modell nur Wolkeneis meldet. Die Kurve dient der klassischen Auswertung und fließt nicht in die Tabelle ein.</w:t>
+      </w:r>
+    </w:p>
+    <w:p>
+      <w:pPr>
+        <w:pStyle w:val="Heading2"/>
+        <w:jc w:val="left"/>
+      </w:pPr>
+      <w:r>
+        <w:t xml:space="preserve">8.7  Beispiel</w:t>
+      </w:r>
+    </w:p>
+    <w:p>
+      <w:pPr/>
+      <w:r>
+        <w:t xml:space="preserve">ICON, 52,29° N / 60,96° W, 08.10.2026 12 UTC (+12 h): Die Luft ist von 894 hPa bis rund 630 hPa gesättigt und bis etwa 560 hPa feucht (RH ≥ 84 %); die 0-°C-Grenze liegt bei 880 hPa. Ausgegeben wird „leicht“ (Raueis) von FL041 bis FL122 und von FL140 bis FL159 im Szenario „Allgemein“; der LWC bleibt ab etwa 850 hPa bei 0,46 g/m³ stehen (Deckel nach Korolev). Dazwischen liegt eine dünne labile Schicht (FL122–FL140, Mischeis), die von ihrer eigenen Unterkante aus gerechnet bis „mäßig“ erreicht. Das Modell meldet bis FL122 Flüssigwasser, darüber nur Spuren von Wolkeneis. Ohne Deckel lag der adiabatische LWC oben bei 1,9 g/m³ und ergab „stark“; ADWICE in der Fassung von 2017 hätte wegen des Modell-Wolkenwassers „mäßig“ ausgegeben. Der Fall wird weiter beobachtet.</w:t>
+      </w:r>
+    </w:p>
+    <w:p>
+      <w:pPr>
+        <w:pStyle w:val="Heading1"/>
+        <w:jc w:val="left"/>
+      </w:pPr>
+      <w:r>
+        <w:t>9  Schichtwolkenerkennung</w:t>
       </w:r>
     </w:p>
     <w:p>
@@ -1446,7 +2026,7 @@
         <w:jc w:val="left"/>
       </w:pPr>
       <w:r>
-        <w:t>9  Hodograph</w:t>
+        <w:t>10  Hodograph</w:t>
       </w:r>
     </w:p>
     <w:p>
@@ -1595,7 +2175,7 @@
         <w:jc w:val="left"/>
       </w:pPr>
       <w:r>
-        <w:t>10  Labilitätsindizes</w:t>
+        <w:t>11  Labilitätsindizes</w:t>
       </w:r>
     </w:p>
     <w:p>
@@ -2007,7 +2587,7 @@
         <w:jc w:val="left"/>
       </w:pPr>
       <w:r>
-        <w:t>11  Bedienung</w:t>
+        <w:t>12  Bedienung</w:t>
       </w:r>
     </w:p>
     <w:p>
@@ -2016,7 +2596,7 @@
         <w:jc w:val="left"/>
       </w:pPr>
       <w:r>
-        <w:t>11.1  Daten laden</w:t>
+        <w:t>12.1  Daten laden</w:t>
       </w:r>
     </w:p>
     <w:p>
@@ -2115,7 +2695,7 @@
         <w:jc w:val="left"/>
       </w:pPr>
       <w:r>
-        <w:t>11.2  Navigation</w:t>
+        <w:t>12.2  Navigation</w:t>
       </w:r>
     </w:p>
     <w:p>
@@ -2164,7 +2744,7 @@
         <w:jc w:val="left"/>
       </w:pPr>
       <w:r>
-        <w:t>11.3  Diagrammwerte am Mauspunkt</w:t>
+        <w:t>12.3  Diagrammwerte am Mauspunkt</w:t>
       </w:r>
     </w:p>
     <w:p>
@@ -2625,7 +3205,7 @@
         <w:jc w:val="left"/>
       </w:pPr>
       <w:r>
-        <w:t>11.4  Optionale Overlays</w:t>
+        <w:t>12.4  Optionale Overlays</w:t>
       </w:r>
     </w:p>
     <w:tbl>
@@ -2739,6 +3319,28 @@
           </w:tcPr>
           <w:p>
             <w:r>
+              <w:t xml:space="preserve">Vereisung</w:t>
+            </w:r>
+          </w:p>
+        </w:tc>
+        <w:tc>
+          <w:tcPr>
+            <w:tcW w:type="dxa" w:w="4561"/>
+          </w:tcPr>
+          <w:p>
+            <w:r>
+              <w:t xml:space="preserve">Vereisungsschichten nach ADWICE (Szenario-Balken am rechten Rand, Intensität als farbige Hinterleuchtung) und −8D-Kurve mit Vereisungsfläche, s. Kap. 8</w:t>
+            </w:r>
+          </w:p>
+        </w:tc>
+      </w:tr>
+      <w:tr>
+        <w:tc>
+          <w:tcPr>
+            <w:tcW w:type="dxa" w:w="4561"/>
+          </w:tcPr>
+          <w:p>
+            <w:r>
               <w:t xml:space="preserve">Wolken im Diagramm</w:t>
             </w:r>
           </w:p>
@@ -2771,7 +3373,7 @@
           </w:tcPr>
           <w:p>
             <w:r>
-              <w:t xml:space="preserve">Wolkenquelle Modell (Standard) statt RH-Heuristik, s. Kap. 8</w:t>
+              <w:t xml:space="preserve">Wolkenquelle Modell (Standard) statt RH-Heuristik, s. Kap. 9</w:t>
             </w:r>
           </w:p>
         </w:tc>
@@ -2850,7 +3452,7 @@
         <w:jc w:val="left"/>
       </w:pPr>
       <w:r>
-        <w:t>11.5  Export</w:t>
+        <w:t>12.5  Export</w:t>
       </w:r>
     </w:p>
     <w:p>
@@ -2865,7 +3467,7 @@
         <w:jc w:val="left"/>
       </w:pPr>
       <w:r>
-        <w:t>12  Literatur</w:t>
+        <w:t>13  Literatur</w:t>
       </w:r>
     </w:p>
     <w:p>
@@ -2873,7 +3475,7 @@
         <w:pStyle w:val="ListBullet"/>
       </w:pPr>
       <w:r>
-        <w:t>Bolton, D. (1980): The computation of equivalent potential temperature. Mon. Wea. Rev., 108, 1046–1053.</w:t>
+        <w:t xml:space="preserve">Bolton, D. (1980): The computation of equivalent potential temperature. Mon. Wea. Rev., 108, 1046–1053.</w:t>
       </w:r>
     </w:p>
     <w:p>
@@ -2881,7 +3483,7 @@
         <w:pStyle w:val="ListBullet"/>
       </w:pPr>
       <w:r>
-        <w:t>Bourgouin, P. (1992): A method to determine precipitation types. Wea. Forecasting, 7, 231–238.</w:t>
+        <w:t xml:space="preserve">Bourgouin, P. (1992): A method to determine precipitation types. Wea. Forecasting, 7, 231–238.</w:t>
       </w:r>
     </w:p>
     <w:p>
@@ -2889,7 +3491,7 @@
         <w:pStyle w:val="ListBullet"/>
       </w:pPr>
       <w:r>
-        <w:t>Bunkers, M. J. et al. (2000): Predicting supercell motion using a new hodograph technique. Wea. Forecasting, 15, 61–79.</w:t>
+        <w:t xml:space="preserve">Bunkers, M. J. et al. (2000): Predicting supercell motion using a new hodograph technique. Wea. Forecasting, 15, 61–79.</w:t>
       </w:r>
     </w:p>
     <w:p>
@@ -2897,7 +3499,7 @@
         <w:pStyle w:val="ListBullet"/>
       </w:pPr>
       <w:r>
-        <w:t>Bunkers, M. J. et al. (2014): Observations of the 21 April 2007 tornadic supercell... [Effective-Layer-Methode]. Wea. Forecasting, 29, 1108–1134.</w:t>
+        <w:t xml:space="preserve">Bunkers, M. J. et al. (2014): Observations of the 21 April 2007 tornadic supercell... [Effective-Layer-Methode]. Wea. Forecasting, 29, 1108–1134.</w:t>
       </w:r>
     </w:p>
     <w:p>
@@ -2905,7 +3507,7 @@
         <w:pStyle w:val="ListBullet"/>
       </w:pPr>
       <w:r>
-        <w:t>Davies-Jones, R. P. (1990): The dependence of core pressure on the ambient flow and the implications for storm motion. J. Atmos. Sci., 47, 2420–2429.</w:t>
+        <w:t xml:space="preserve">Davies-Jones, R. P. (1990): The dependence of core pressure on the ambient flow and the implications for storm motion. J. Atmos. Sci., 47, 2420–2429.</w:t>
       </w:r>
     </w:p>
     <w:p>
@@ -2913,7 +3515,7 @@
         <w:pStyle w:val="ListBullet"/>
       </w:pPr>
       <w:r>
-        <w:t>Doswell, C. A., and Rasmussen, E. N. (1994): The effect of neglecting the virtual temperature correction on CAPE calculations. Wea. Forecasting, 9, 625–629.</w:t>
+        <w:t xml:space="preserve">Doswell, C. A., and Rasmussen, E. N. (1994): The effect of neglecting the virtual temperature correction on CAPE calculations. Wea. Forecasting, 9, 625–629.</w:t>
       </w:r>
     </w:p>
     <w:p>
@@ -2921,7 +3523,7 @@
         <w:pStyle w:val="ListBullet"/>
       </w:pPr>
       <w:r>
-        <w:t>Thompson, R. L. et al. (2004): Close proximity soundings within supercell environments obtained from the Rapid Update Cycle. Wea. Forecasting, 19, 1243–1261.</w:t>
+        <w:t xml:space="preserve">Forbes, G. S. et al. (1993): Examination of conditions in the proximity of pilot reports of icing during STORM-FEST. Preprints, 5th Int. Conf. on Aviation Weather Systems, AMS, 282–286.</w:t>
       </w:r>
     </w:p>
     <w:p>
@@ -2929,7 +3531,55 @@
         <w:pStyle w:val="ListBullet"/>
       </w:pPr>
       <w:r>
-        <w:t>WMO (2018): Guide to Meteorological Instruments and Methods of Observation. WMO-No. 8.</w:t>
+        <w:t xml:space="preserve">Kalinka, F. et al. (2017): The in-flight icing warning system ADWICE for European airspace – current structure, recent improvements and verification results. Meteorol. Z., 26, 441–455. DOI 10.1127/metz/2017/0756.</w:t>
+      </w:r>
+    </w:p>
+    <w:p>
+      <w:pPr>
+        <w:pStyle w:val="ListBullet"/>
+      </w:pPr>
+      <w:r>
+        <w:t xml:space="preserve">Korolev, A. V., Isaac, G. A., Strapp, J. W., Cober, S. G., and Barker, H. W. (2007): In situ measurements of liquid water content profiles in midlatitude stratiform clouds. Q. J. R. Meteorol. Soc., 133, 1693–1699. DOI 10.1002/qj.147.</w:t>
+      </w:r>
+    </w:p>
+    <w:p>
+      <w:pPr>
+        <w:pStyle w:val="ListBullet"/>
+      </w:pPr>
+      <w:r>
+        <w:t xml:space="preserve">Krutina, M. F. H. (2006): Flugmeteorologie – Vereisung. Wolkenschnüffler, Stand Dezember 2006.</w:t>
+      </w:r>
+    </w:p>
+    <w:p>
+      <w:pPr>
+        <w:pStyle w:val="ListBullet"/>
+      </w:pPr>
+      <w:r>
+        <w:t xml:space="preserve">Lewis, W. (1947): A flight investigation of the meteorological conditions conducive to the formation of ice on airplanes. NACA Tech. Note 1393.</w:t>
+      </w:r>
+    </w:p>
+    <w:p>
+      <w:pPr>
+        <w:pStyle w:val="ListBullet"/>
+      </w:pPr>
+      <w:r>
+        <w:t xml:space="preserve">Tafferner, A. et al. (2003): ADWICE: Advanced Diagnosis and Warning System for Aircraft Icing Environments. Wea. Forecasting, 18, 184–203.</w:t>
+      </w:r>
+    </w:p>
+    <w:p>
+      <w:pPr>
+        <w:pStyle w:val="ListBullet"/>
+      </w:pPr>
+      <w:r>
+        <w:t xml:space="preserve">Thompson, R. L. et al. (2004): Close proximity soundings within supercell environments obtained from the Rapid Update Cycle. Wea. Forecasting, 19, 1243–1261.</w:t>
+      </w:r>
+    </w:p>
+    <w:p>
+      <w:pPr>
+        <w:pStyle w:val="ListBullet"/>
+      </w:pPr>
+      <w:r>
+        <w:t xml:space="preserve">WMO (2018): Guide to Meteorological Instruments and Methods of Observation. WMO-No. 8.</w:t>
       </w:r>
     </w:p>
     <w:sectPr>

</xml_diff>